<commit_message>
thesis: assemble Pediatric Research paper series (9-paper programme)
Prepare the EXPLAIN thesis for publication as a staged Pediatric Research
programme.

- Split P3 (regulatory-organ omnibus) into P3a Cerebral haemodynamics & ICP
  (new cerebral-paper.md) + P3b Homeostatic regulation (other-systems-paper.md
  transformed in place); sub-labels keep P4-P8 cross-refs valid.
- Draft P5 integrated-model flagship (integrated-model-paper.md) and assemble
  P7 duct/FO-dependent CHD manuscript (chd-paper.md).
- Add pediatric-research-plan/: programme slate, reusable series blocks,
  front-matter + cover letters (P1-P7), P8 review pre-inquiry, and the
  MAIN_PATH_STATE checkpoint.
- Trim all Impact Statements to PR's <=100-word cap series-wide (single
  paragraph, verified under strict and Word-style counts).
- Reference-verification pass (_references.md) and P2/P4 consistency edits;
  P1 docx Python->JavaScript source correction.

Co-Authored-By: Claude Opus 4.8 <noreply@anthropic.com>
</commit_message>
<xml_diff>
--- a/thesis/ExplainCircPaper(27012026)_WPdB_TA_WvM.docx
+++ b/thesis/ExplainCircPaper(27012026)_WPdB_TA_WvM.docx
@@ -423,7 +423,7 @@
           <w:sz w:val="20"/>
           <w:szCs w:val="20"/>
         </w:rPr>
-        <w:t>and annotated Python source code</w:t>
+        <w:t>and annotated source code</w:t>
       </w:r>
       <w:r>
         <w:rPr>
@@ -2400,7 +2400,7 @@
           <w:sz w:val="20"/>
           <w:szCs w:val="20"/>
         </w:rPr>
-        <w:t>The complete source code in Python is available upon request.</w:t>
+        <w:t>The complete source code is available upon request.</w:t>
       </w:r>
     </w:p>
     <w:p>
@@ -15522,7 +15522,7 @@
           <w:sz w:val="20"/>
           <w:szCs w:val="20"/>
         </w:rPr>
-        <w:t>An important additional objective of the present work is to enable model developers to understand, use, and modify the model and corresponding code.  The source code of the Python implementation of EXPLAIN is available upon request. The source code is extensively annotated. Developers with undergraduate level software engineering experience, and basic knowledge of the programming language Python, should, after a few days of familiarization with the environment, be able to:</w:t>
+        <w:t>An important additional objective of the present work is to enable model developers to understand, use, and modify the model and corresponding code.  The source code of EXPLAIN is available upon request. The source code is extensively annotated. Developers with undergraduate level software engineering experience, and basic knowledge of the JavaScript/TypeScript programming language, should, after a few days of familiarization with the environment, be able to:</w:t>
       </w:r>
     </w:p>
     <w:p>
@@ -15788,7 +15788,7 @@
           <w:sz w:val="20"/>
           <w:szCs w:val="20"/>
         </w:rPr>
-        <w:t xml:space="preserve">The model developer environment is implemented in an interactive Python notebook, which combines source code, diagrams, and written text in a single environment.  Model code can be modified and run from there.  The code which combines and sequences the different model software components is visible and non-proprietary but will typically not be modified by the developer.  </w:t>
+        <w:t xml:space="preserve">The model developer environment is implemented as a framework-agnostic simulation engine written in JavaScript/TypeScript that runs inside a Web Worker, with each physiological component a self-contained module and complete scenarios defined declaratively as JSON model definitions.  Model code can be modified and run from there.  The code which combines and sequences the different model software components is visible and non-proprietary but will typically not be modified by the developer.  </w:t>
       </w:r>
       <w:bookmarkEnd w:id="13"/>
       <w:r>

</xml_diff>